<commit_message>
fix: corrige NPS y complecion T1/T3 + anade presentacion del video
</commit_message>
<xml_diff>
--- a/Preguntas_GCS_VIDEO.docx
+++ b/Preguntas_GCS_VIDEO.docx
@@ -3278,7 +3278,7 @@
           <w:sz w:val="20"/>
           <w:szCs w:val="20"/>
         </w:rPr>
-        <w:t>Al consolidar los indicadores psicométricos globales de la evaluación, el Prototipo A obtuvo un UMUX medio de 69.05 y un NPS medio de 7.07, mientras que el Prototipo B obtuvo un UMUX medio de 68.15 y un NPS medio de 7.79.</w:t>
+        <w:t>Al consolidar los indicadores psicométricos globales de la evaluación, el Prototipo A obtuvo un UMUX medio de 69.05 y un NPS de 0, mientras que el Prototipo B obtuvo un UMUX medio de 68.15 y un NPS de +42.9. (El NPS se calcula como %Promotores − %Detractores según el script oficial; la nota media de recomendación en bruto fue de 7.07/10 para A y 7.79/10 para B.)</w:t>
       </w:r>
     </w:p>
     <w:p>
@@ -3332,7 +3332,7 @@
           <w:sz w:val="20"/>
           <w:szCs w:val="20"/>
         </w:rPr>
-        <w:t xml:space="preserve">Por otro lado, el </w:t>
+        <w:t>Por otro lado, el Prototipo B gana en intención de recomendación (NPS). A pesar de los problemas puntuales de navegación que ralentizaron las tareas T2 y T4, su estética general limpia, el uso equilibrado de los espacios en blanco y la estructura visual de pantallas como Dashboard.png e id.png generaron un impacto emocional muy positivo. Los usuarios disculparon las pequeñas trabas operativas debido a una percepción de diseño moderna y profesional, lo que elevó el NPS hasta +42.9 (nota media de recomendación 7.79/10).</w:t>
       </w:r>
       <w:r>
         <w:rPr>
@@ -3342,15 +3342,13 @@
           <w:sz w:val="20"/>
           <w:szCs w:val="20"/>
         </w:rPr>
-        <w:t>Prototipo B gana en intención de recomendación (NPS)</w:t>
-      </w:r>
-      <w:r>
-        <w:rPr>
-          <w:rFonts w:ascii="Times New Roman" w:hAnsi="Times New Roman" w:cs="Times New Roman"/>
-          <w:sz w:val="20"/>
-          <w:szCs w:val="20"/>
-        </w:rPr>
-        <w:t>. A pesar de los problemas puntuales de navegación que ralentizaron las tareas T2 y T4, su estética general limpia, el uso equilibrado de los espacios en blanco y la estructura visual de pantallas como Dashboard.png e id.png generaron un impacto emocional muy positivo. Los usuarios disculparon las pequeñas trabas operativas debido a una percepción de diseño moderna y profesional, lo que elevó el NPS medio hasta un 7.79.</w:t>
+      </w:r>
+      <w:r>
+        <w:rPr>
+          <w:rFonts w:ascii="Times New Roman" w:hAnsi="Times New Roman" w:cs="Times New Roman"/>
+          <w:sz w:val="20"/>
+          <w:szCs w:val="20"/>
+        </w:rPr>
       </w:r>
     </w:p>
     <w:p>
@@ -4823,7 +4821,7 @@
           <w:sz w:val="20"/>
           <w:szCs w:val="20"/>
         </w:rPr>
-        <w:t xml:space="preserve">Por su parte, las tareas </w:t>
+        <w:t>Por su parte, la tarea T1 (Nueva solicitud) mostró un comportamiento idéntico entre ambos prototipos, con una tasa de éxito del 78.6% en los dos y variaciones de tiempo inferiores a un segundo. En la tarea T3 (Ver solicitud), en cambio, el Prototipo B superó claramente a A en compleción (85.7% frente a 64.3%). En conjunto, estos resultados confirman que las estructuras de backend subyacentes eran sólidas y que los problemas detectados eran estrictamente de diseño de interacción superficial.</w:t>
       </w:r>
       <w:r>
         <w:rPr>
@@ -4833,15 +4831,13 @@
           <w:sz w:val="20"/>
           <w:szCs w:val="20"/>
         </w:rPr>
-        <w:t>T1 y T3 mostraron una estabilidad absoluta</w:t>
-      </w:r>
-      <w:r>
-        <w:rPr>
-          <w:rFonts w:ascii="Times New Roman" w:hAnsi="Times New Roman" w:cs="Times New Roman"/>
-          <w:sz w:val="20"/>
-          <w:szCs w:val="20"/>
-        </w:rPr>
-        <w:t xml:space="preserve">: los flujos de creación y lectura simple registraron tasas de éxito idénticas, del 100%, y variaciones de tiempo inferiores a un segundo, lo que confirma que las estructuras de </w:t>
+      </w:r>
+      <w:r>
+        <w:rPr>
+          <w:rFonts w:ascii="Times New Roman" w:hAnsi="Times New Roman" w:cs="Times New Roman"/>
+          <w:sz w:val="20"/>
+          <w:szCs w:val="20"/>
+        </w:rPr>
       </w:r>
       <w:proofErr w:type="spellStart"/>
       <w:r>
@@ -4850,7 +4846,6 @@
           <w:sz w:val="20"/>
           <w:szCs w:val="20"/>
         </w:rPr>
-        <w:t>backend</w:t>
       </w:r>
       <w:proofErr w:type="spellEnd"/>
       <w:r>
@@ -4859,7 +4854,6 @@
           <w:sz w:val="20"/>
           <w:szCs w:val="20"/>
         </w:rPr>
-        <w:t xml:space="preserve"> subyacentes eran sólidas y que los problemas detectados eran estrictamente de diseño de interacción superficial.</w:t>
       </w:r>
     </w:p>
     <w:p>

</xml_diff>